<commit_message>
Można pobrać wszystkie załączniki po ich zakończeniu
</commit_message>
<xml_diff>
--- a/Projekt/app/docs/Zal_4a.docx
+++ b/Projekt/app/docs/Zal_4a.docx
@@ -113,18 +113,20 @@
           <w:b/>
           <w:bCs/>
           <w:sz w:val="28"/>
-        </w:rPr>
-        <w:t>ZATRUDNIENIA</w:t>
+          <w:szCs w:val="28"/>
+        </w:rPr>
+        <w:t xml:space="preserve">{{ </w:t>
       </w:r>
+      <w:proofErr w:type="spellStart"/>
       <w:r>
         <w:rPr>
           <w:rFonts w:ascii="Cambria" w:hAnsi="Cambria"/>
           <w:b/>
           <w:bCs/>
           <w:sz w:val="28"/>
-          <w:lang w:val="pl-PL"/>
-        </w:rPr>
-        <w:t>/STAŻU/</w:t>
+          <w:szCs w:val="28"/>
+        </w:rPr>
+        <w:t>zaliczenie_na_podstawie</w:t>
       </w:r>
       <w:r>
         <w:rPr>
@@ -132,19 +134,20 @@
           <w:b/>
           <w:bCs/>
           <w:sz w:val="28"/>
-          <w:lang w:val="pl-PL"/>
-        </w:rPr>
-        <w:t>DZIAŁALNOŚCI GOSPODARCZEJ</w:t>
+          <w:szCs w:val="28"/>
+        </w:rPr>
+        <w:t>_tytul</w:t>
       </w:r>
+      <w:proofErr w:type="spellEnd"/>
       <w:r>
         <w:rPr>
           <w:rFonts w:ascii="Cambria" w:hAnsi="Cambria"/>
           <w:b/>
           <w:bCs/>
           <w:sz w:val="28"/>
-          <w:lang w:val="pl-PL"/>
-        </w:rPr>
-        <w:t>*</w:t>
+          <w:szCs w:val="28"/>
+        </w:rPr>
+        <w:t xml:space="preserve"> }}</w:t>
       </w:r>
     </w:p>
     <w:p>
@@ -201,6 +204,7 @@
           <w:rFonts w:ascii="Cambria" w:hAnsi="Cambria" w:cs="Calibri"/>
           <w:sz w:val="22"/>
           <w:szCs w:val="22"/>
+          <w:lang w:val="pl-PL"/>
         </w:rPr>
       </w:pPr>
       <w:r>
@@ -209,7 +213,36 @@
           <w:sz w:val="22"/>
           <w:szCs w:val="22"/>
         </w:rPr>
-        <w:t>Student / ka: ...................................................................................................................................................................</w:t>
+        <w:t xml:space="preserve">Student / ka: </w:t>
+      </w:r>
+      <w:r>
+        <w:rPr>
+          <w:rFonts w:ascii="Cambria" w:hAnsi="Cambria" w:cs="Calibri"/>
+          <w:sz w:val="22"/>
+          <w:szCs w:val="22"/>
+          <w:lang w:val="pl-PL"/>
+        </w:rPr>
+        <w:t xml:space="preserve">{{ </w:t>
+      </w:r>
+      <w:proofErr w:type="spellStart"/>
+      <w:r>
+        <w:rPr>
+          <w:rFonts w:ascii="Cambria" w:hAnsi="Cambria" w:cs="Calibri"/>
+          <w:sz w:val="22"/>
+          <w:szCs w:val="22"/>
+          <w:lang w:val="pl-PL"/>
+        </w:rPr>
+        <w:t>imie_nazwisko_studenta</w:t>
+      </w:r>
+      <w:proofErr w:type="spellEnd"/>
+      <w:r>
+        <w:rPr>
+          <w:rFonts w:ascii="Cambria" w:hAnsi="Cambria" w:cs="Calibri"/>
+          <w:sz w:val="22"/>
+          <w:szCs w:val="22"/>
+          <w:lang w:val="pl-PL"/>
+        </w:rPr>
+        <w:t xml:space="preserve"> }}</w:t>
       </w:r>
     </w:p>
     <w:p>
@@ -222,6 +255,7 @@
           <w:rFonts w:ascii="Cambria" w:hAnsi="Cambria" w:cs="Calibri"/>
           <w:sz w:val="22"/>
           <w:szCs w:val="22"/>
+          <w:lang w:val="pl-PL"/>
         </w:rPr>
       </w:pPr>
       <w:r>
@@ -230,7 +264,36 @@
           <w:sz w:val="22"/>
           <w:szCs w:val="22"/>
         </w:rPr>
-        <w:t>Nr albumu .....................................</w:t>
+        <w:t xml:space="preserve">Nr albumu </w:t>
+      </w:r>
+      <w:r>
+        <w:rPr>
+          <w:rFonts w:ascii="Cambria" w:hAnsi="Cambria" w:cs="Calibri"/>
+          <w:sz w:val="22"/>
+          <w:szCs w:val="22"/>
+          <w:lang w:val="pl-PL"/>
+        </w:rPr>
+        <w:t xml:space="preserve">{{ </w:t>
+      </w:r>
+      <w:proofErr w:type="spellStart"/>
+      <w:r>
+        <w:rPr>
+          <w:rFonts w:ascii="Cambria" w:hAnsi="Cambria" w:cs="Calibri"/>
+          <w:sz w:val="22"/>
+          <w:szCs w:val="22"/>
+          <w:lang w:val="pl-PL"/>
+        </w:rPr>
+        <w:t>nr_indeksu</w:t>
+      </w:r>
+      <w:proofErr w:type="spellEnd"/>
+      <w:r>
+        <w:rPr>
+          <w:rFonts w:ascii="Cambria" w:hAnsi="Cambria" w:cs="Calibri"/>
+          <w:sz w:val="22"/>
+          <w:szCs w:val="22"/>
+          <w:lang w:val="pl-PL"/>
+        </w:rPr>
+        <w:t xml:space="preserve"> }}</w:t>
       </w:r>
     </w:p>
     <w:p>
@@ -276,6 +339,7 @@
           <w:rFonts w:ascii="Cambria" w:hAnsi="Cambria" w:cs="Calibri"/>
           <w:sz w:val="22"/>
           <w:szCs w:val="22"/>
+          <w:lang w:val="pl-PL"/>
         </w:rPr>
       </w:pPr>
       <w:r>
@@ -284,7 +348,36 @@
           <w:sz w:val="22"/>
           <w:szCs w:val="22"/>
         </w:rPr>
-        <w:t>Specjalność: ....................................................................................................................................................................</w:t>
+        <w:t xml:space="preserve">Specjalność: </w:t>
+      </w:r>
+      <w:r>
+        <w:rPr>
+          <w:rFonts w:ascii="Cambria" w:hAnsi="Cambria" w:cs="Calibri"/>
+          <w:sz w:val="22"/>
+          <w:szCs w:val="22"/>
+          <w:lang w:val="pl-PL"/>
+        </w:rPr>
+        <w:t xml:space="preserve">{{ </w:t>
+      </w:r>
+      <w:proofErr w:type="spellStart"/>
+      <w:r>
+        <w:rPr>
+          <w:rFonts w:ascii="Cambria" w:hAnsi="Cambria" w:cs="Calibri"/>
+          <w:sz w:val="22"/>
+          <w:szCs w:val="22"/>
+          <w:lang w:val="pl-PL"/>
+        </w:rPr>
+        <w:t>specjalnosc</w:t>
+      </w:r>
+      <w:proofErr w:type="spellEnd"/>
+      <w:r>
+        <w:rPr>
+          <w:rFonts w:ascii="Cambria" w:hAnsi="Cambria" w:cs="Calibri"/>
+          <w:sz w:val="22"/>
+          <w:szCs w:val="22"/>
+          <w:lang w:val="pl-PL"/>
+        </w:rPr>
+        <w:t xml:space="preserve"> }}</w:t>
       </w:r>
     </w:p>
     <w:p>
@@ -292,44 +385,54 @@
         <w:pStyle w:val="Tekstpodstawowywcity"/>
         <w:ind w:left="0"/>
         <w:jc w:val="both"/>
-        <w:rPr>
-          <w:rFonts w:ascii="Cambria" w:hAnsi="Cambria"/>
-          <w:sz w:val="22"/>
-          <w:szCs w:val="22"/>
-        </w:rPr>
-      </w:pPr>
-      <w:r>
-        <w:rPr>
-          <w:rFonts w:ascii="Cambria" w:hAnsi="Cambria"/>
-          <w:sz w:val="22"/>
-          <w:szCs w:val="22"/>
-        </w:rPr>
-        <w:t xml:space="preserve">W ramach pracy </w:t>
-      </w:r>
-      <w:r>
-        <w:rPr>
-          <w:rFonts w:ascii="Cambria" w:hAnsi="Cambria"/>
-          <w:sz w:val="22"/>
-          <w:szCs w:val="22"/>
-        </w:rPr>
-        <w:t>zawodowej</w:t>
-      </w:r>
-      <w:r>
-        <w:rPr>
-          <w:rFonts w:ascii="Cambria" w:hAnsi="Cambria"/>
-          <w:sz w:val="22"/>
-          <w:szCs w:val="22"/>
-        </w:rPr>
-        <w:t>/stażu</w:t>
-      </w:r>
-      <w:r>
         <w:rPr>
           <w:rFonts w:ascii="Cambria" w:hAnsi="Cambria"/>
           <w:sz w:val="22"/>
           <w:szCs w:val="22"/>
           <w:lang w:val="pl-PL"/>
         </w:rPr>
-        <w:t>/</w:t>
+      </w:pPr>
+      <w:r>
+        <w:rPr>
+          <w:rFonts w:ascii="Cambria" w:hAnsi="Cambria"/>
+          <w:sz w:val="22"/>
+          <w:szCs w:val="22"/>
+        </w:rPr>
+        <w:t xml:space="preserve">W ramach </w:t>
+      </w:r>
+      <w:r>
+        <w:rPr>
+          <w:rFonts w:ascii="Cambria" w:hAnsi="Cambria"/>
+          <w:sz w:val="22"/>
+          <w:szCs w:val="22"/>
+        </w:rPr>
+        <w:t xml:space="preserve">{{ </w:t>
+      </w:r>
+      <w:proofErr w:type="spellStart"/>
+      <w:r>
+        <w:rPr>
+          <w:rFonts w:ascii="Cambria" w:hAnsi="Cambria"/>
+          <w:sz w:val="22"/>
+          <w:szCs w:val="22"/>
+        </w:rPr>
+        <w:t>zaliczenie_na_podstawie</w:t>
+      </w:r>
+      <w:proofErr w:type="spellEnd"/>
+      <w:r>
+        <w:rPr>
+          <w:rFonts w:ascii="Cambria" w:hAnsi="Cambria"/>
+          <w:sz w:val="22"/>
+          <w:szCs w:val="22"/>
+        </w:rPr>
+        <w:t xml:space="preserve"> }}</w:t>
+      </w:r>
+      <w:r>
+        <w:rPr>
+          <w:rFonts w:ascii="Cambria" w:hAnsi="Cambria"/>
+          <w:sz w:val="22"/>
+          <w:szCs w:val="22"/>
+        </w:rPr>
+        <w:t xml:space="preserve"> w wymiarze </w:t>
       </w:r>
       <w:r>
         <w:rPr>
@@ -338,16 +441,9 @@
           <w:szCs w:val="22"/>
           <w:lang w:val="pl-PL"/>
         </w:rPr>
-        <w:t>działalności gospodarczej</w:t>
+        <w:t xml:space="preserve">{{ </w:t>
       </w:r>
-      <w:r>
-        <w:rPr>
-          <w:rFonts w:ascii="Cambria" w:hAnsi="Cambria"/>
-          <w:sz w:val="22"/>
-          <w:szCs w:val="22"/>
-        </w:rPr>
-        <w:t>* w wymiarze  ……….</w:t>
-      </w:r>
+      <w:proofErr w:type="spellStart"/>
       <w:r>
         <w:rPr>
           <w:rFonts w:ascii="Cambria" w:hAnsi="Cambria"/>
@@ -355,32 +451,9 @@
           <w:szCs w:val="22"/>
           <w:lang w:val="pl-PL"/>
         </w:rPr>
-        <w:t xml:space="preserve"> </w:t>
+        <w:t>ilosc_godzin_praktyk</w:t>
       </w:r>
-      <w:r>
-        <w:rPr>
-          <w:rFonts w:ascii="Cambria" w:hAnsi="Cambria"/>
-          <w:sz w:val="22"/>
-          <w:szCs w:val="22"/>
-        </w:rPr>
-        <w:t xml:space="preserve">godzin </w:t>
-      </w:r>
-      <w:r>
-        <w:rPr>
-          <w:rFonts w:ascii="Cambria" w:hAnsi="Cambria"/>
-          <w:sz w:val="22"/>
-          <w:szCs w:val="22"/>
-        </w:rPr>
-        <w:t xml:space="preserve"> </w:t>
-      </w:r>
-      <w:r>
-        <w:rPr>
-          <w:rFonts w:ascii="Cambria" w:hAnsi="Cambria"/>
-          <w:sz w:val="22"/>
-          <w:szCs w:val="22"/>
-        </w:rPr>
-        <w:t>uzyskał</w:t>
-      </w:r>
+      <w:proofErr w:type="spellEnd"/>
       <w:r>
         <w:rPr>
           <w:rFonts w:ascii="Cambria" w:hAnsi="Cambria"/>
@@ -388,7 +461,7 @@
           <w:szCs w:val="22"/>
           <w:lang w:val="pl-PL"/>
         </w:rPr>
-        <w:t>/a</w:t>
+        <w:t xml:space="preserve"> }}</w:t>
       </w:r>
       <w:r>
         <w:rPr>
@@ -405,49 +478,30 @@
           <w:sz w:val="22"/>
           <w:szCs w:val="22"/>
         </w:rPr>
-        <w:t xml:space="preserve"> </w:t>
+        <w:t xml:space="preserve">godzin </w:t>
       </w:r>
       <w:r>
         <w:rPr>
-          <w:rFonts w:ascii="Cambria" w:hAnsi="Cambria"/>
+          <w:rFonts w:ascii="Cambria" w:hAnsi="Cambria" w:cs="Calibri"/>
           <w:sz w:val="22"/>
-          <w:szCs w:val="22"/>
-        </w:rPr>
-        <w:t>/</w:t>
+        </w:rPr>
+        <w:t xml:space="preserve">{{ </w:t>
       </w:r>
+      <w:proofErr w:type="spellStart"/>
       <w:r>
         <w:rPr>
-          <w:rFonts w:ascii="Cambria" w:hAnsi="Cambria"/>
+          <w:rFonts w:ascii="Cambria" w:hAnsi="Cambria" w:cs="Calibri"/>
           <w:sz w:val="22"/>
-          <w:szCs w:val="22"/>
-          <w:lang w:val="pl-PL"/>
-        </w:rPr>
-        <w:t xml:space="preserve">nie </w:t>
+        </w:rPr>
+        <w:t>czy_efekty_uzyskane</w:t>
       </w:r>
+      <w:proofErr w:type="spellEnd"/>
       <w:r>
         <w:rPr>
-          <w:rFonts w:ascii="Cambria" w:hAnsi="Cambria"/>
+          <w:rFonts w:ascii="Cambria" w:hAnsi="Cambria" w:cs="Calibri"/>
           <w:sz w:val="22"/>
-          <w:szCs w:val="22"/>
-        </w:rPr>
-        <w:t>uzyskał</w:t>
-      </w:r>
-      <w:r>
-        <w:rPr>
-          <w:rFonts w:ascii="Cambria" w:hAnsi="Cambria"/>
-          <w:sz w:val="22"/>
-          <w:szCs w:val="22"/>
-          <w:lang w:val="pl-PL"/>
-        </w:rPr>
-        <w:t>/a</w:t>
-      </w:r>
-      <w:r>
-        <w:rPr>
-          <w:rFonts w:ascii="Cambria" w:hAnsi="Cambria"/>
-          <w:sz w:val="22"/>
-          <w:szCs w:val="22"/>
-        </w:rPr>
-        <w:t xml:space="preserve"> *</w:t>
+        </w:rPr>
+        <w:t xml:space="preserve"> }}</w:t>
       </w:r>
       <w:r>
         <w:rPr>
@@ -474,8 +528,8 @@
       </w:tblPr>
       <w:tblGrid>
         <w:gridCol w:w="481"/>
-        <w:gridCol w:w="6034"/>
-        <w:gridCol w:w="3571"/>
+        <w:gridCol w:w="6017"/>
+        <w:gridCol w:w="3588"/>
       </w:tblGrid>
       <w:tr>
         <w:tc>
@@ -635,89 +689,29 @@
             </w:pPr>
             <w:r>
               <w:rPr>
-                <w:rFonts w:ascii="Cambria" w:hAnsi="Cambria"/>
-                <w:sz w:val="22"/>
-                <w:szCs w:val="22"/>
-              </w:rPr>
-              <w:t>u</w:t>
-            </w:r>
-            <w:r>
-              <w:rPr>
-                <w:rFonts w:ascii="Cambria" w:hAnsi="Cambria"/>
-                <w:sz w:val="22"/>
-                <w:szCs w:val="22"/>
-              </w:rPr>
-              <w:t>zyskał</w:t>
-            </w:r>
-            <w:r>
-              <w:rPr>
-                <w:rFonts w:ascii="Cambria" w:hAnsi="Cambria"/>
-                <w:sz w:val="22"/>
-                <w:szCs w:val="22"/>
-              </w:rPr>
-              <w:t>/a</w:t>
-            </w:r>
-            <w:r>
-              <w:rPr>
-                <w:rFonts w:ascii="Cambria" w:hAnsi="Cambria"/>
-                <w:sz w:val="22"/>
-                <w:szCs w:val="22"/>
-              </w:rPr>
-              <w:t xml:space="preserve"> *</w:t>
-            </w:r>
-          </w:p>
-          <w:p>
-            <w:pPr>
-              <w:spacing w:before="120" w:after="120"/>
-              <w:jc w:val="center"/>
-              <w:rPr>
-                <w:rFonts w:ascii="Cambria" w:hAnsi="Cambria"/>
-                <w:sz w:val="22"/>
-                <w:szCs w:val="22"/>
-              </w:rPr>
-            </w:pPr>
-            <w:r>
-              <w:rPr>
-                <w:rFonts w:ascii="Cambria" w:hAnsi="Cambria"/>
-                <w:sz w:val="22"/>
-                <w:szCs w:val="22"/>
-              </w:rPr>
-              <w:t>uzyskał/a częściowo*</w:t>
-            </w:r>
-          </w:p>
-          <w:p>
-            <w:pPr>
-              <w:spacing w:before="120" w:after="120"/>
-              <w:jc w:val="center"/>
-              <w:rPr>
-                <w:rFonts w:ascii="Cambria" w:hAnsi="Cambria"/>
-                <w:sz w:val="22"/>
-                <w:szCs w:val="22"/>
-              </w:rPr>
-            </w:pPr>
-            <w:r>
-              <w:rPr>
-                <w:rFonts w:ascii="Cambria" w:hAnsi="Cambria"/>
-                <w:sz w:val="22"/>
-                <w:szCs w:val="22"/>
-              </w:rPr>
-              <w:t>nie uzyskał</w:t>
-            </w:r>
-            <w:r>
-              <w:rPr>
-                <w:rFonts w:ascii="Cambria" w:hAnsi="Cambria"/>
-                <w:sz w:val="22"/>
-                <w:szCs w:val="22"/>
-              </w:rPr>
-              <w:t>/a</w:t>
-            </w:r>
-            <w:r>
-              <w:rPr>
-                <w:rFonts w:ascii="Cambria" w:hAnsi="Cambria"/>
-                <w:sz w:val="22"/>
-                <w:szCs w:val="22"/>
-              </w:rPr>
-              <w:t>*</w:t>
+                <w:rFonts w:ascii="Cambria" w:hAnsi="Cambria" w:cs="Calibri"/>
+                <w:sz w:val="20"/>
+                <w:szCs w:val="22"/>
+              </w:rPr>
+              <w:t xml:space="preserve">{{ </w:t>
+            </w:r>
+            <w:proofErr w:type="spellStart"/>
+            <w:r>
+              <w:rPr>
+                <w:rFonts w:ascii="Cambria" w:hAnsi="Cambria" w:cs="Calibri"/>
+                <w:sz w:val="20"/>
+                <w:szCs w:val="22"/>
+              </w:rPr>
+              <w:t>czy_efekt_uzyskany</w:t>
+            </w:r>
+            <w:proofErr w:type="spellEnd"/>
+            <w:r>
+              <w:rPr>
+                <w:rFonts w:ascii="Cambria" w:hAnsi="Cambria" w:cs="Calibri"/>
+                <w:sz w:val="20"/>
+                <w:szCs w:val="22"/>
+              </w:rPr>
+              <w:t>[0] }}</w:t>
             </w:r>
           </w:p>
         </w:tc>
@@ -814,49 +808,29 @@
             </w:pPr>
             <w:r>
               <w:rPr>
-                <w:rFonts w:ascii="Cambria" w:hAnsi="Cambria"/>
-                <w:sz w:val="22"/>
-                <w:szCs w:val="22"/>
-              </w:rPr>
-              <w:t>uzyskał/a *</w:t>
-            </w:r>
-          </w:p>
-          <w:p>
-            <w:pPr>
-              <w:spacing w:before="120" w:after="120"/>
-              <w:jc w:val="center"/>
-              <w:rPr>
-                <w:rFonts w:ascii="Cambria" w:hAnsi="Cambria"/>
-                <w:sz w:val="22"/>
-                <w:szCs w:val="22"/>
-              </w:rPr>
-            </w:pPr>
-            <w:r>
-              <w:rPr>
-                <w:rFonts w:ascii="Cambria" w:hAnsi="Cambria"/>
-                <w:sz w:val="22"/>
-                <w:szCs w:val="22"/>
-              </w:rPr>
-              <w:t>uzyskał/a częściowo*</w:t>
-            </w:r>
-          </w:p>
-          <w:p>
-            <w:pPr>
-              <w:spacing w:before="120" w:after="120"/>
-              <w:jc w:val="center"/>
-              <w:rPr>
-                <w:rFonts w:ascii="Cambria" w:hAnsi="Cambria"/>
-                <w:sz w:val="22"/>
-                <w:szCs w:val="22"/>
-              </w:rPr>
-            </w:pPr>
-            <w:r>
-              <w:rPr>
-                <w:rFonts w:ascii="Cambria" w:hAnsi="Cambria"/>
-                <w:sz w:val="22"/>
-                <w:szCs w:val="22"/>
-              </w:rPr>
-              <w:t>nie uzyskał/a*</w:t>
+                <w:rFonts w:ascii="Cambria" w:hAnsi="Cambria" w:cs="Calibri"/>
+                <w:sz w:val="20"/>
+                <w:szCs w:val="22"/>
+              </w:rPr>
+              <w:t xml:space="preserve">{{ </w:t>
+            </w:r>
+            <w:proofErr w:type="spellStart"/>
+            <w:r>
+              <w:rPr>
+                <w:rFonts w:ascii="Cambria" w:hAnsi="Cambria" w:cs="Calibri"/>
+                <w:sz w:val="20"/>
+                <w:szCs w:val="22"/>
+              </w:rPr>
+              <w:t>czy_efekt_uzyskany</w:t>
+            </w:r>
+            <w:proofErr w:type="spellEnd"/>
+            <w:r>
+              <w:rPr>
+                <w:rFonts w:ascii="Cambria" w:hAnsi="Cambria" w:cs="Calibri"/>
+                <w:sz w:val="20"/>
+                <w:szCs w:val="22"/>
+              </w:rPr>
+              <w:t>[1] }}</w:t>
             </w:r>
           </w:p>
         </w:tc>
@@ -951,49 +925,29 @@
             </w:pPr>
             <w:r>
               <w:rPr>
-                <w:rFonts w:ascii="Cambria" w:hAnsi="Cambria"/>
-                <w:sz w:val="22"/>
-                <w:szCs w:val="22"/>
-              </w:rPr>
-              <w:t>uzyskał/a *</w:t>
-            </w:r>
-          </w:p>
-          <w:p>
-            <w:pPr>
-              <w:spacing w:before="120" w:after="120"/>
-              <w:jc w:val="center"/>
-              <w:rPr>
-                <w:rFonts w:ascii="Cambria" w:hAnsi="Cambria"/>
-                <w:sz w:val="22"/>
-                <w:szCs w:val="22"/>
-              </w:rPr>
-            </w:pPr>
-            <w:r>
-              <w:rPr>
-                <w:rFonts w:ascii="Cambria" w:hAnsi="Cambria"/>
-                <w:sz w:val="22"/>
-                <w:szCs w:val="22"/>
-              </w:rPr>
-              <w:t>uzyskał/a częściowo*</w:t>
-            </w:r>
-          </w:p>
-          <w:p>
-            <w:pPr>
-              <w:spacing w:before="120" w:after="120"/>
-              <w:jc w:val="center"/>
-              <w:rPr>
-                <w:rFonts w:ascii="Cambria" w:hAnsi="Cambria"/>
-                <w:sz w:val="22"/>
-                <w:szCs w:val="22"/>
-              </w:rPr>
-            </w:pPr>
-            <w:r>
-              <w:rPr>
-                <w:rFonts w:ascii="Cambria" w:hAnsi="Cambria"/>
-                <w:sz w:val="22"/>
-                <w:szCs w:val="22"/>
-              </w:rPr>
-              <w:t>nie uzyskał/a*</w:t>
+                <w:rFonts w:ascii="Cambria" w:hAnsi="Cambria" w:cs="Calibri"/>
+                <w:sz w:val="20"/>
+                <w:szCs w:val="22"/>
+              </w:rPr>
+              <w:t xml:space="preserve">{{ </w:t>
+            </w:r>
+            <w:proofErr w:type="spellStart"/>
+            <w:r>
+              <w:rPr>
+                <w:rFonts w:ascii="Cambria" w:hAnsi="Cambria" w:cs="Calibri"/>
+                <w:sz w:val="20"/>
+                <w:szCs w:val="22"/>
+              </w:rPr>
+              <w:t>czy_efekt_uzyskany</w:t>
+            </w:r>
+            <w:proofErr w:type="spellEnd"/>
+            <w:r>
+              <w:rPr>
+                <w:rFonts w:ascii="Cambria" w:hAnsi="Cambria" w:cs="Calibri"/>
+                <w:sz w:val="20"/>
+                <w:szCs w:val="22"/>
+              </w:rPr>
+              <w:t>[2] }}</w:t>
             </w:r>
           </w:p>
         </w:tc>
@@ -1088,49 +1042,29 @@
             </w:pPr>
             <w:r>
               <w:rPr>
-                <w:rFonts w:ascii="Cambria" w:hAnsi="Cambria"/>
-                <w:sz w:val="22"/>
-                <w:szCs w:val="22"/>
-              </w:rPr>
-              <w:t>uzyskał/a *</w:t>
-            </w:r>
-          </w:p>
-          <w:p>
-            <w:pPr>
-              <w:spacing w:before="120" w:after="120"/>
-              <w:jc w:val="center"/>
-              <w:rPr>
-                <w:rFonts w:ascii="Cambria" w:hAnsi="Cambria"/>
-                <w:sz w:val="22"/>
-                <w:szCs w:val="22"/>
-              </w:rPr>
-            </w:pPr>
-            <w:r>
-              <w:rPr>
-                <w:rFonts w:ascii="Cambria" w:hAnsi="Cambria"/>
-                <w:sz w:val="22"/>
-                <w:szCs w:val="22"/>
-              </w:rPr>
-              <w:t>uzyskał/a częściowo*</w:t>
-            </w:r>
-          </w:p>
-          <w:p>
-            <w:pPr>
-              <w:spacing w:before="120" w:after="120"/>
-              <w:jc w:val="center"/>
-              <w:rPr>
-                <w:rFonts w:ascii="Cambria" w:hAnsi="Cambria"/>
-                <w:sz w:val="22"/>
-                <w:szCs w:val="22"/>
-              </w:rPr>
-            </w:pPr>
-            <w:r>
-              <w:rPr>
-                <w:rFonts w:ascii="Cambria" w:hAnsi="Cambria"/>
-                <w:sz w:val="22"/>
-                <w:szCs w:val="22"/>
-              </w:rPr>
-              <w:t>nie uzyskał/a*</w:t>
+                <w:rFonts w:ascii="Cambria" w:hAnsi="Cambria" w:cs="Calibri"/>
+                <w:sz w:val="20"/>
+                <w:szCs w:val="22"/>
+              </w:rPr>
+              <w:t xml:space="preserve">{{ </w:t>
+            </w:r>
+            <w:proofErr w:type="spellStart"/>
+            <w:r>
+              <w:rPr>
+                <w:rFonts w:ascii="Cambria" w:hAnsi="Cambria" w:cs="Calibri"/>
+                <w:sz w:val="20"/>
+                <w:szCs w:val="22"/>
+              </w:rPr>
+              <w:t>czy_efekt_uzyskany</w:t>
+            </w:r>
+            <w:proofErr w:type="spellEnd"/>
+            <w:r>
+              <w:rPr>
+                <w:rFonts w:ascii="Cambria" w:hAnsi="Cambria" w:cs="Calibri"/>
+                <w:sz w:val="20"/>
+                <w:szCs w:val="22"/>
+              </w:rPr>
+              <w:t>[3] }}</w:t>
             </w:r>
           </w:p>
         </w:tc>
@@ -1225,49 +1159,29 @@
             </w:pPr>
             <w:r>
               <w:rPr>
-                <w:rFonts w:ascii="Cambria" w:hAnsi="Cambria"/>
-                <w:sz w:val="22"/>
-                <w:szCs w:val="22"/>
-              </w:rPr>
-              <w:t>uzyskał/a *</w:t>
-            </w:r>
-          </w:p>
-          <w:p>
-            <w:pPr>
-              <w:spacing w:before="120" w:after="120"/>
-              <w:jc w:val="center"/>
-              <w:rPr>
-                <w:rFonts w:ascii="Cambria" w:hAnsi="Cambria"/>
-                <w:sz w:val="22"/>
-                <w:szCs w:val="22"/>
-              </w:rPr>
-            </w:pPr>
-            <w:r>
-              <w:rPr>
-                <w:rFonts w:ascii="Cambria" w:hAnsi="Cambria"/>
-                <w:sz w:val="22"/>
-                <w:szCs w:val="22"/>
-              </w:rPr>
-              <w:t>uzyskał/a częściowo*</w:t>
-            </w:r>
-          </w:p>
-          <w:p>
-            <w:pPr>
-              <w:spacing w:before="120" w:after="120"/>
-              <w:jc w:val="center"/>
-              <w:rPr>
-                <w:rFonts w:ascii="Cambria" w:hAnsi="Cambria"/>
-                <w:sz w:val="22"/>
-                <w:szCs w:val="22"/>
-              </w:rPr>
-            </w:pPr>
-            <w:r>
-              <w:rPr>
-                <w:rFonts w:ascii="Cambria" w:hAnsi="Cambria"/>
-                <w:sz w:val="22"/>
-                <w:szCs w:val="22"/>
-              </w:rPr>
-              <w:t>nie uzyskał/a*</w:t>
+                <w:rFonts w:ascii="Cambria" w:hAnsi="Cambria" w:cs="Calibri"/>
+                <w:sz w:val="20"/>
+                <w:szCs w:val="22"/>
+              </w:rPr>
+              <w:t xml:space="preserve">{{ </w:t>
+            </w:r>
+            <w:proofErr w:type="spellStart"/>
+            <w:r>
+              <w:rPr>
+                <w:rFonts w:ascii="Cambria" w:hAnsi="Cambria" w:cs="Calibri"/>
+                <w:sz w:val="20"/>
+                <w:szCs w:val="22"/>
+              </w:rPr>
+              <w:t>czy_efekt_uzyskany</w:t>
+            </w:r>
+            <w:proofErr w:type="spellEnd"/>
+            <w:r>
+              <w:rPr>
+                <w:rFonts w:ascii="Cambria" w:hAnsi="Cambria" w:cs="Calibri"/>
+                <w:sz w:val="20"/>
+                <w:szCs w:val="22"/>
+              </w:rPr>
+              <w:t>[4] }}</w:t>
             </w:r>
           </w:p>
         </w:tc>
@@ -1371,49 +1285,29 @@
             </w:pPr>
             <w:r>
               <w:rPr>
-                <w:rFonts w:ascii="Cambria" w:hAnsi="Cambria"/>
-                <w:sz w:val="22"/>
-                <w:szCs w:val="22"/>
-              </w:rPr>
-              <w:t>uzyskał/a *</w:t>
-            </w:r>
-          </w:p>
-          <w:p>
-            <w:pPr>
-              <w:spacing w:before="120" w:after="120"/>
-              <w:jc w:val="center"/>
-              <w:rPr>
-                <w:rFonts w:ascii="Cambria" w:hAnsi="Cambria"/>
-                <w:sz w:val="22"/>
-                <w:szCs w:val="22"/>
-              </w:rPr>
-            </w:pPr>
-            <w:r>
-              <w:rPr>
-                <w:rFonts w:ascii="Cambria" w:hAnsi="Cambria"/>
-                <w:sz w:val="22"/>
-                <w:szCs w:val="22"/>
-              </w:rPr>
-              <w:t>uzyskał/a częściowo*</w:t>
-            </w:r>
-          </w:p>
-          <w:p>
-            <w:pPr>
-              <w:spacing w:before="120" w:after="120"/>
-              <w:jc w:val="center"/>
-              <w:rPr>
-                <w:rFonts w:ascii="Cambria" w:hAnsi="Cambria"/>
-                <w:sz w:val="22"/>
-                <w:szCs w:val="22"/>
-              </w:rPr>
-            </w:pPr>
-            <w:r>
-              <w:rPr>
-                <w:rFonts w:ascii="Cambria" w:hAnsi="Cambria"/>
-                <w:sz w:val="22"/>
-                <w:szCs w:val="22"/>
-              </w:rPr>
-              <w:t>nie uzyskał/a*</w:t>
+                <w:rFonts w:ascii="Cambria" w:hAnsi="Cambria" w:cs="Calibri"/>
+                <w:sz w:val="20"/>
+                <w:szCs w:val="22"/>
+              </w:rPr>
+              <w:t xml:space="preserve">{{ </w:t>
+            </w:r>
+            <w:proofErr w:type="spellStart"/>
+            <w:r>
+              <w:rPr>
+                <w:rFonts w:ascii="Cambria" w:hAnsi="Cambria" w:cs="Calibri"/>
+                <w:sz w:val="20"/>
+                <w:szCs w:val="22"/>
+              </w:rPr>
+              <w:t>czy_efekt_uzyskany</w:t>
+            </w:r>
+            <w:proofErr w:type="spellEnd"/>
+            <w:r>
+              <w:rPr>
+                <w:rFonts w:ascii="Cambria" w:hAnsi="Cambria" w:cs="Calibri"/>
+                <w:sz w:val="20"/>
+                <w:szCs w:val="22"/>
+              </w:rPr>
+              <w:t>[5] }}</w:t>
             </w:r>
           </w:p>
         </w:tc>
@@ -1450,7 +1344,6 @@
                 <w:sz w:val="22"/>
                 <w:szCs w:val="22"/>
               </w:rPr>
-              <w:lastRenderedPageBreak/>
               <w:t>07</w:t>
             </w:r>
           </w:p>
@@ -1509,49 +1402,29 @@
             </w:pPr>
             <w:r>
               <w:rPr>
-                <w:rFonts w:ascii="Cambria" w:hAnsi="Cambria"/>
-                <w:sz w:val="22"/>
-                <w:szCs w:val="22"/>
-              </w:rPr>
-              <w:t>uzyskał/a *</w:t>
-            </w:r>
-          </w:p>
-          <w:p>
-            <w:pPr>
-              <w:spacing w:before="120" w:after="120"/>
-              <w:jc w:val="center"/>
-              <w:rPr>
-                <w:rFonts w:ascii="Cambria" w:hAnsi="Cambria"/>
-                <w:sz w:val="22"/>
-                <w:szCs w:val="22"/>
-              </w:rPr>
-            </w:pPr>
-            <w:r>
-              <w:rPr>
-                <w:rFonts w:ascii="Cambria" w:hAnsi="Cambria"/>
-                <w:sz w:val="22"/>
-                <w:szCs w:val="22"/>
-              </w:rPr>
-              <w:t>uzyskał/a częściowo*</w:t>
-            </w:r>
-          </w:p>
-          <w:p>
-            <w:pPr>
-              <w:spacing w:before="120" w:after="120"/>
-              <w:jc w:val="center"/>
-              <w:rPr>
-                <w:rFonts w:ascii="Cambria" w:hAnsi="Cambria"/>
-                <w:sz w:val="22"/>
-                <w:szCs w:val="22"/>
-              </w:rPr>
-            </w:pPr>
-            <w:r>
-              <w:rPr>
-                <w:rFonts w:ascii="Cambria" w:hAnsi="Cambria"/>
-                <w:sz w:val="22"/>
-                <w:szCs w:val="22"/>
-              </w:rPr>
-              <w:t>nie uzyskał/a*</w:t>
+                <w:rFonts w:ascii="Cambria" w:hAnsi="Cambria" w:cs="Calibri"/>
+                <w:sz w:val="20"/>
+                <w:szCs w:val="22"/>
+              </w:rPr>
+              <w:t xml:space="preserve">{{ </w:t>
+            </w:r>
+            <w:proofErr w:type="spellStart"/>
+            <w:r>
+              <w:rPr>
+                <w:rFonts w:ascii="Cambria" w:hAnsi="Cambria" w:cs="Calibri"/>
+                <w:sz w:val="20"/>
+                <w:szCs w:val="22"/>
+              </w:rPr>
+              <w:t>czy_efekt_uzyskany</w:t>
+            </w:r>
+            <w:proofErr w:type="spellEnd"/>
+            <w:r>
+              <w:rPr>
+                <w:rFonts w:ascii="Cambria" w:hAnsi="Cambria" w:cs="Calibri"/>
+                <w:sz w:val="20"/>
+                <w:szCs w:val="22"/>
+              </w:rPr>
+              <w:t>[6] }}</w:t>
             </w:r>
           </w:p>
         </w:tc>
@@ -1588,6 +1461,7 @@
                 <w:sz w:val="22"/>
                 <w:szCs w:val="22"/>
               </w:rPr>
+              <w:lastRenderedPageBreak/>
               <w:t>08</w:t>
             </w:r>
           </w:p>
@@ -1646,49 +1520,29 @@
             </w:pPr>
             <w:r>
               <w:rPr>
-                <w:rFonts w:ascii="Cambria" w:hAnsi="Cambria"/>
-                <w:sz w:val="22"/>
-                <w:szCs w:val="22"/>
-              </w:rPr>
-              <w:t>uzyskał/a *</w:t>
-            </w:r>
-          </w:p>
-          <w:p>
-            <w:pPr>
-              <w:spacing w:before="120" w:after="120"/>
-              <w:jc w:val="center"/>
-              <w:rPr>
-                <w:rFonts w:ascii="Cambria" w:hAnsi="Cambria"/>
-                <w:sz w:val="22"/>
-                <w:szCs w:val="22"/>
-              </w:rPr>
-            </w:pPr>
-            <w:r>
-              <w:rPr>
-                <w:rFonts w:ascii="Cambria" w:hAnsi="Cambria"/>
-                <w:sz w:val="22"/>
-                <w:szCs w:val="22"/>
-              </w:rPr>
-              <w:t>uzyskał/a częściowo*</w:t>
-            </w:r>
-          </w:p>
-          <w:p>
-            <w:pPr>
-              <w:spacing w:before="120" w:after="120"/>
-              <w:jc w:val="center"/>
-              <w:rPr>
-                <w:rFonts w:ascii="Cambria" w:hAnsi="Cambria"/>
-                <w:sz w:val="22"/>
-                <w:szCs w:val="22"/>
-              </w:rPr>
-            </w:pPr>
-            <w:r>
-              <w:rPr>
-                <w:rFonts w:ascii="Cambria" w:hAnsi="Cambria"/>
-                <w:sz w:val="22"/>
-                <w:szCs w:val="22"/>
-              </w:rPr>
-              <w:t>nie uzyskał/a*</w:t>
+                <w:rFonts w:ascii="Cambria" w:hAnsi="Cambria" w:cs="Calibri"/>
+                <w:sz w:val="20"/>
+                <w:szCs w:val="22"/>
+              </w:rPr>
+              <w:t xml:space="preserve">{{ </w:t>
+            </w:r>
+            <w:proofErr w:type="spellStart"/>
+            <w:r>
+              <w:rPr>
+                <w:rFonts w:ascii="Cambria" w:hAnsi="Cambria" w:cs="Calibri"/>
+                <w:sz w:val="20"/>
+                <w:szCs w:val="22"/>
+              </w:rPr>
+              <w:t>czy_efekt_uzyskany</w:t>
+            </w:r>
+            <w:proofErr w:type="spellEnd"/>
+            <w:r>
+              <w:rPr>
+                <w:rFonts w:ascii="Cambria" w:hAnsi="Cambria" w:cs="Calibri"/>
+                <w:sz w:val="20"/>
+                <w:szCs w:val="22"/>
+              </w:rPr>
+              <w:t>[7] }}</w:t>
             </w:r>
           </w:p>
         </w:tc>
@@ -1783,49 +1637,29 @@
             </w:pPr>
             <w:r>
               <w:rPr>
-                <w:rFonts w:ascii="Cambria" w:hAnsi="Cambria"/>
-                <w:sz w:val="22"/>
-                <w:szCs w:val="22"/>
-              </w:rPr>
-              <w:t>uzyskał/a *</w:t>
-            </w:r>
-          </w:p>
-          <w:p>
-            <w:pPr>
-              <w:spacing w:before="120" w:after="120"/>
-              <w:jc w:val="center"/>
-              <w:rPr>
-                <w:rFonts w:ascii="Cambria" w:hAnsi="Cambria"/>
-                <w:sz w:val="22"/>
-                <w:szCs w:val="22"/>
-              </w:rPr>
-            </w:pPr>
-            <w:r>
-              <w:rPr>
-                <w:rFonts w:ascii="Cambria" w:hAnsi="Cambria"/>
-                <w:sz w:val="22"/>
-                <w:szCs w:val="22"/>
-              </w:rPr>
-              <w:t>uzyskał/a częściowo*</w:t>
-            </w:r>
-          </w:p>
-          <w:p>
-            <w:pPr>
-              <w:spacing w:before="120" w:after="120"/>
-              <w:jc w:val="center"/>
-              <w:rPr>
-                <w:rFonts w:ascii="Cambria" w:hAnsi="Cambria"/>
-                <w:sz w:val="22"/>
-                <w:szCs w:val="22"/>
-              </w:rPr>
-            </w:pPr>
-            <w:r>
-              <w:rPr>
-                <w:rFonts w:ascii="Cambria" w:hAnsi="Cambria"/>
-                <w:sz w:val="22"/>
-                <w:szCs w:val="22"/>
-              </w:rPr>
-              <w:t>nie uzyskał/a*</w:t>
+                <w:rFonts w:ascii="Cambria" w:hAnsi="Cambria" w:cs="Calibri"/>
+                <w:sz w:val="20"/>
+                <w:szCs w:val="22"/>
+              </w:rPr>
+              <w:t xml:space="preserve">{{ </w:t>
+            </w:r>
+            <w:proofErr w:type="spellStart"/>
+            <w:r>
+              <w:rPr>
+                <w:rFonts w:ascii="Cambria" w:hAnsi="Cambria" w:cs="Calibri"/>
+                <w:sz w:val="20"/>
+                <w:szCs w:val="22"/>
+              </w:rPr>
+              <w:t>czy_efekt_uzyskany</w:t>
+            </w:r>
+            <w:proofErr w:type="spellEnd"/>
+            <w:r>
+              <w:rPr>
+                <w:rFonts w:ascii="Cambria" w:hAnsi="Cambria" w:cs="Calibri"/>
+                <w:sz w:val="20"/>
+                <w:szCs w:val="22"/>
+              </w:rPr>
+              <w:t>[8] }}</w:t>
             </w:r>
           </w:p>
         </w:tc>
@@ -1918,49 +1752,29 @@
             </w:pPr>
             <w:r>
               <w:rPr>
-                <w:rFonts w:ascii="Cambria" w:hAnsi="Cambria"/>
-                <w:sz w:val="22"/>
-                <w:szCs w:val="22"/>
-              </w:rPr>
-              <w:t>uzyskał/a *</w:t>
-            </w:r>
-          </w:p>
-          <w:p>
-            <w:pPr>
-              <w:spacing w:before="120" w:after="120"/>
-              <w:jc w:val="center"/>
-              <w:rPr>
-                <w:rFonts w:ascii="Cambria" w:hAnsi="Cambria"/>
-                <w:sz w:val="22"/>
-                <w:szCs w:val="22"/>
-              </w:rPr>
-            </w:pPr>
-            <w:r>
-              <w:rPr>
-                <w:rFonts w:ascii="Cambria" w:hAnsi="Cambria"/>
-                <w:sz w:val="22"/>
-                <w:szCs w:val="22"/>
-              </w:rPr>
-              <w:t>uzyskał/a częściowo*</w:t>
-            </w:r>
-          </w:p>
-          <w:p>
-            <w:pPr>
-              <w:spacing w:before="120" w:after="120"/>
-              <w:jc w:val="center"/>
-              <w:rPr>
-                <w:rFonts w:ascii="Cambria" w:hAnsi="Cambria"/>
-                <w:sz w:val="22"/>
-                <w:szCs w:val="22"/>
-              </w:rPr>
-            </w:pPr>
-            <w:r>
-              <w:rPr>
-                <w:rFonts w:ascii="Cambria" w:hAnsi="Cambria"/>
-                <w:sz w:val="22"/>
-                <w:szCs w:val="22"/>
-              </w:rPr>
-              <w:t>nie uzyskał/a*</w:t>
+                <w:rFonts w:ascii="Cambria" w:hAnsi="Cambria" w:cs="Calibri"/>
+                <w:sz w:val="20"/>
+                <w:szCs w:val="22"/>
+              </w:rPr>
+              <w:t xml:space="preserve">{{ </w:t>
+            </w:r>
+            <w:proofErr w:type="spellStart"/>
+            <w:r>
+              <w:rPr>
+                <w:rFonts w:ascii="Cambria" w:hAnsi="Cambria" w:cs="Calibri"/>
+                <w:sz w:val="20"/>
+                <w:szCs w:val="22"/>
+              </w:rPr>
+              <w:t>czy_efekt_uzyskany</w:t>
+            </w:r>
+            <w:proofErr w:type="spellEnd"/>
+            <w:r>
+              <w:rPr>
+                <w:rFonts w:ascii="Cambria" w:hAnsi="Cambria" w:cs="Calibri"/>
+                <w:sz w:val="20"/>
+                <w:szCs w:val="22"/>
+              </w:rPr>
+              <w:t>[9] }}</w:t>
             </w:r>
           </w:p>
         </w:tc>
@@ -2053,49 +1867,29 @@
             </w:pPr>
             <w:r>
               <w:rPr>
-                <w:rFonts w:ascii="Cambria" w:hAnsi="Cambria"/>
-                <w:sz w:val="22"/>
-                <w:szCs w:val="22"/>
-              </w:rPr>
-              <w:t>uzyskał/a *</w:t>
-            </w:r>
-          </w:p>
-          <w:p>
-            <w:pPr>
-              <w:spacing w:before="120" w:after="120"/>
-              <w:jc w:val="center"/>
-              <w:rPr>
-                <w:rFonts w:ascii="Cambria" w:hAnsi="Cambria"/>
-                <w:sz w:val="22"/>
-                <w:szCs w:val="22"/>
-              </w:rPr>
-            </w:pPr>
-            <w:r>
-              <w:rPr>
-                <w:rFonts w:ascii="Cambria" w:hAnsi="Cambria"/>
-                <w:sz w:val="22"/>
-                <w:szCs w:val="22"/>
-              </w:rPr>
-              <w:t>uzyskał/a częściowo*</w:t>
-            </w:r>
-          </w:p>
-          <w:p>
-            <w:pPr>
-              <w:spacing w:before="120" w:after="120"/>
-              <w:jc w:val="center"/>
-              <w:rPr>
-                <w:rFonts w:ascii="Cambria" w:hAnsi="Cambria"/>
-                <w:sz w:val="22"/>
-                <w:szCs w:val="22"/>
-              </w:rPr>
-            </w:pPr>
-            <w:r>
-              <w:rPr>
-                <w:rFonts w:ascii="Cambria" w:hAnsi="Cambria"/>
-                <w:sz w:val="22"/>
-                <w:szCs w:val="22"/>
-              </w:rPr>
-              <w:t>nie uzyskał/a*</w:t>
+                <w:rFonts w:ascii="Cambria" w:hAnsi="Cambria" w:cs="Calibri"/>
+                <w:sz w:val="20"/>
+                <w:szCs w:val="22"/>
+              </w:rPr>
+              <w:t xml:space="preserve">{{ </w:t>
+            </w:r>
+            <w:proofErr w:type="spellStart"/>
+            <w:r>
+              <w:rPr>
+                <w:rFonts w:ascii="Cambria" w:hAnsi="Cambria" w:cs="Calibri"/>
+                <w:sz w:val="20"/>
+                <w:szCs w:val="22"/>
+              </w:rPr>
+              <w:t>czy_efekt_uzyskany</w:t>
+            </w:r>
+            <w:proofErr w:type="spellEnd"/>
+            <w:r>
+              <w:rPr>
+                <w:rFonts w:ascii="Cambria" w:hAnsi="Cambria" w:cs="Calibri"/>
+                <w:sz w:val="20"/>
+                <w:szCs w:val="22"/>
+              </w:rPr>
+              <w:t>[10] }}</w:t>
             </w:r>
           </w:p>
         </w:tc>
@@ -2188,49 +1982,29 @@
             </w:pPr>
             <w:r>
               <w:rPr>
-                <w:rFonts w:ascii="Cambria" w:hAnsi="Cambria"/>
-                <w:sz w:val="22"/>
-                <w:szCs w:val="22"/>
-              </w:rPr>
-              <w:t>uzyskał/a *</w:t>
-            </w:r>
-          </w:p>
-          <w:p>
-            <w:pPr>
-              <w:spacing w:before="120" w:after="120"/>
-              <w:jc w:val="center"/>
-              <w:rPr>
-                <w:rFonts w:ascii="Cambria" w:hAnsi="Cambria"/>
-                <w:sz w:val="22"/>
-                <w:szCs w:val="22"/>
-              </w:rPr>
-            </w:pPr>
-            <w:r>
-              <w:rPr>
-                <w:rFonts w:ascii="Cambria" w:hAnsi="Cambria"/>
-                <w:sz w:val="22"/>
-                <w:szCs w:val="22"/>
-              </w:rPr>
-              <w:t>uzyskał/a częściowo*</w:t>
-            </w:r>
-          </w:p>
-          <w:p>
-            <w:pPr>
-              <w:spacing w:before="120" w:after="120"/>
-              <w:jc w:val="center"/>
-              <w:rPr>
-                <w:rFonts w:ascii="Cambria" w:hAnsi="Cambria"/>
-                <w:sz w:val="22"/>
-                <w:szCs w:val="22"/>
-              </w:rPr>
-            </w:pPr>
-            <w:r>
-              <w:rPr>
-                <w:rFonts w:ascii="Cambria" w:hAnsi="Cambria"/>
-                <w:sz w:val="22"/>
-                <w:szCs w:val="22"/>
-              </w:rPr>
-              <w:t>nie uzyskał/a*</w:t>
+                <w:rFonts w:ascii="Cambria" w:hAnsi="Cambria" w:cs="Calibri"/>
+                <w:sz w:val="20"/>
+                <w:szCs w:val="22"/>
+              </w:rPr>
+              <w:t xml:space="preserve">{{ </w:t>
+            </w:r>
+            <w:proofErr w:type="spellStart"/>
+            <w:r>
+              <w:rPr>
+                <w:rFonts w:ascii="Cambria" w:hAnsi="Cambria" w:cs="Calibri"/>
+                <w:sz w:val="20"/>
+                <w:szCs w:val="22"/>
+              </w:rPr>
+              <w:t>czy_efekt_uzyskany</w:t>
+            </w:r>
+            <w:proofErr w:type="spellEnd"/>
+            <w:r>
+              <w:rPr>
+                <w:rFonts w:ascii="Cambria" w:hAnsi="Cambria" w:cs="Calibri"/>
+                <w:sz w:val="20"/>
+                <w:szCs w:val="22"/>
+              </w:rPr>
+              <w:t>[11] }}</w:t>
             </w:r>
           </w:p>
         </w:tc>
@@ -2341,49 +2115,29 @@
             </w:pPr>
             <w:r>
               <w:rPr>
-                <w:rFonts w:ascii="Cambria" w:hAnsi="Cambria"/>
-                <w:sz w:val="22"/>
-                <w:szCs w:val="22"/>
-              </w:rPr>
-              <w:t>uzyskał/a *</w:t>
-            </w:r>
-          </w:p>
-          <w:p>
-            <w:pPr>
-              <w:spacing w:before="120" w:after="120"/>
-              <w:jc w:val="center"/>
-              <w:rPr>
-                <w:rFonts w:ascii="Cambria" w:hAnsi="Cambria"/>
-                <w:sz w:val="22"/>
-                <w:szCs w:val="22"/>
-              </w:rPr>
-            </w:pPr>
-            <w:r>
-              <w:rPr>
-                <w:rFonts w:ascii="Cambria" w:hAnsi="Cambria"/>
-                <w:sz w:val="22"/>
-                <w:szCs w:val="22"/>
-              </w:rPr>
-              <w:t>uzyskał/a częściowo*</w:t>
-            </w:r>
-          </w:p>
-          <w:p>
-            <w:pPr>
-              <w:spacing w:before="120" w:after="120"/>
-              <w:jc w:val="center"/>
-              <w:rPr>
-                <w:rFonts w:ascii="Cambria" w:hAnsi="Cambria"/>
-                <w:sz w:val="22"/>
-                <w:szCs w:val="22"/>
-              </w:rPr>
-            </w:pPr>
-            <w:r>
-              <w:rPr>
-                <w:rFonts w:ascii="Cambria" w:hAnsi="Cambria"/>
-                <w:sz w:val="22"/>
-                <w:szCs w:val="22"/>
-              </w:rPr>
-              <w:t>nie uzyskał/a*</w:t>
+                <w:rFonts w:ascii="Cambria" w:hAnsi="Cambria" w:cs="Calibri"/>
+                <w:sz w:val="20"/>
+                <w:szCs w:val="22"/>
+              </w:rPr>
+              <w:t xml:space="preserve">{{ </w:t>
+            </w:r>
+            <w:proofErr w:type="spellStart"/>
+            <w:r>
+              <w:rPr>
+                <w:rFonts w:ascii="Cambria" w:hAnsi="Cambria" w:cs="Calibri"/>
+                <w:sz w:val="20"/>
+                <w:szCs w:val="22"/>
+              </w:rPr>
+              <w:t>czy_efekt_uzyskany</w:t>
+            </w:r>
+            <w:proofErr w:type="spellEnd"/>
+            <w:r>
+              <w:rPr>
+                <w:rFonts w:ascii="Cambria" w:hAnsi="Cambria" w:cs="Calibri"/>
+                <w:sz w:val="20"/>
+                <w:szCs w:val="22"/>
+              </w:rPr>
+              <w:t>[12] }}</w:t>
             </w:r>
           </w:p>
         </w:tc>
@@ -2474,33 +2228,66 @@
     <w:p>
       <w:pPr>
         <w:pStyle w:val="Tekstpodstawowywcity"/>
-        <w:ind w:left="0"/>
         <w:jc w:val="right"/>
+        <w:rPr>
+          <w:rFonts w:ascii="Cambria" w:hAnsi="Cambria"/>
+        </w:rPr>
+      </w:pPr>
+      <w:r>
         <w:rPr>
           <w:rFonts w:ascii="Cambria" w:hAnsi="Cambria"/>
           <w:lang w:val="pl-PL"/>
         </w:rPr>
-      </w:pPr>
+        <w:t xml:space="preserve">{{ </w:t>
+      </w:r>
+      <w:proofErr w:type="spellStart"/>
       <w:r>
         <w:rPr>
           <w:rFonts w:ascii="Cambria" w:hAnsi="Cambria"/>
           <w:lang w:val="pl-PL"/>
         </w:rPr>
-        <w:t>…………</w:t>
+        <w:t>data_wyniku_komisji</w:t>
+      </w:r>
+      <w:proofErr w:type="spellEnd"/>
+      <w:r>
+        <w:rPr>
+          <w:rFonts w:ascii="Cambria" w:hAnsi="Cambria"/>
+          <w:lang w:val="pl-PL"/>
+        </w:rPr>
+        <w:t xml:space="preserve"> }}</w:t>
       </w:r>
       <w:r>
         <w:rPr>
           <w:rFonts w:ascii="Cambria" w:hAnsi="Cambria"/>
           <w:lang w:val="pl-PL"/>
         </w:rPr>
-        <w:t>………………..</w:t>
+        <w:t xml:space="preserve">, </w:t>
       </w:r>
       <w:r>
         <w:rPr>
           <w:rFonts w:ascii="Cambria" w:hAnsi="Cambria"/>
-          <w:lang w:val="pl-PL"/>
-        </w:rPr>
-        <w:t>…………………………..</w:t>
+        </w:rPr>
+        <w:t xml:space="preserve">{{ </w:t>
+      </w:r>
+      <w:proofErr w:type="spellStart"/>
+      <w:r>
+        <w:rPr>
+          <w:rFonts w:ascii="Cambria" w:hAnsi="Cambria"/>
+        </w:rPr>
+        <w:t>podpisujacy_komisji</w:t>
+      </w:r>
+      <w:proofErr w:type="spellEnd"/>
+      <w:r>
+        <w:rPr>
+          <w:rFonts w:ascii="Cambria" w:hAnsi="Cambria"/>
+        </w:rPr>
+        <w:t xml:space="preserve"> }}</w:t>
+      </w:r>
+      <w:r>
+        <w:rPr>
+          <w:rFonts w:ascii="Cambria" w:hAnsi="Cambria"/>
+        </w:rPr>
+        <w:tab/>
       </w:r>
     </w:p>
     <w:p>
@@ -2556,186 +2343,6 @@
         </w:rPr>
         <w:t>Przewodniczącego Komisji do spraw praktyk</w:t>
       </w:r>
-    </w:p>
-    <w:p>
-      <w:pPr>
-        <w:pStyle w:val="Tekstpodstawowywcity"/>
-        <w:ind w:left="0"/>
-        <w:jc w:val="both"/>
-        <w:rPr>
-          <w:rFonts w:ascii="Cambria" w:hAnsi="Cambria"/>
-          <w:lang w:val="pl-PL"/>
-        </w:rPr>
-      </w:pPr>
-    </w:p>
-    <w:p>
-      <w:pPr>
-        <w:pStyle w:val="Nagwek1"/>
-        <w:spacing w:before="0"/>
-        <w:rPr>
-          <w:rFonts w:ascii="Cambria" w:hAnsi="Cambria" w:cs="Times New Roman"/>
-          <w:b w:val="0"/>
-          <w:sz w:val="24"/>
-          <w:szCs w:val="24"/>
-          <w:vertAlign w:val="superscript"/>
-        </w:rPr>
-      </w:pPr>
-      <w:r>
-        <w:rPr>
-          <w:rFonts w:ascii="Cambria" w:hAnsi="Cambria" w:cs="Times New Roman"/>
-          <w:b w:val="0"/>
-          <w:sz w:val="24"/>
-          <w:szCs w:val="24"/>
-          <w:vertAlign w:val="superscript"/>
-        </w:rPr>
-        <w:tab/>
-      </w:r>
-      <w:r>
-        <w:rPr>
-          <w:rFonts w:ascii="Cambria" w:hAnsi="Cambria" w:cs="Times New Roman"/>
-          <w:b w:val="0"/>
-          <w:sz w:val="24"/>
-          <w:szCs w:val="24"/>
-          <w:vertAlign w:val="superscript"/>
-        </w:rPr>
-        <w:tab/>
-      </w:r>
-      <w:r>
-        <w:rPr>
-          <w:rFonts w:ascii="Cambria" w:hAnsi="Cambria" w:cs="Times New Roman"/>
-          <w:b w:val="0"/>
-          <w:sz w:val="24"/>
-          <w:szCs w:val="24"/>
-          <w:vertAlign w:val="superscript"/>
-        </w:rPr>
-        <w:tab/>
-      </w:r>
-      <w:r>
-        <w:rPr>
-          <w:rFonts w:ascii="Cambria" w:hAnsi="Cambria" w:cs="Times New Roman"/>
-          <w:b w:val="0"/>
-          <w:sz w:val="24"/>
-          <w:szCs w:val="24"/>
-          <w:vertAlign w:val="superscript"/>
-        </w:rPr>
-        <w:tab/>
-      </w:r>
-      <w:r>
-        <w:rPr>
-          <w:rFonts w:ascii="Cambria" w:hAnsi="Cambria" w:cs="Times New Roman"/>
-          <w:b w:val="0"/>
-          <w:sz w:val="24"/>
-          <w:szCs w:val="24"/>
-          <w:vertAlign w:val="superscript"/>
-        </w:rPr>
-        <w:tab/>
-      </w:r>
-      <w:r>
-        <w:rPr>
-          <w:rFonts w:ascii="Cambria" w:hAnsi="Cambria" w:cs="Times New Roman"/>
-          <w:b w:val="0"/>
-          <w:sz w:val="24"/>
-          <w:szCs w:val="24"/>
-          <w:vertAlign w:val="superscript"/>
-        </w:rPr>
-        <w:tab/>
-      </w:r>
-      <w:r>
-        <w:rPr>
-          <w:rFonts w:ascii="Cambria" w:hAnsi="Cambria" w:cs="Times New Roman"/>
-          <w:b w:val="0"/>
-          <w:sz w:val="24"/>
-          <w:szCs w:val="24"/>
-          <w:vertAlign w:val="superscript"/>
-        </w:rPr>
-        <w:tab/>
-      </w:r>
-      <w:r>
-        <w:rPr>
-          <w:rFonts w:ascii="Cambria" w:hAnsi="Cambria" w:cs="Times New Roman"/>
-          <w:b w:val="0"/>
-          <w:sz w:val="24"/>
-          <w:szCs w:val="24"/>
-          <w:vertAlign w:val="superscript"/>
-        </w:rPr>
-        <w:t xml:space="preserve">               </w:t>
-      </w:r>
-      <w:r>
-        <w:rPr>
-          <w:rFonts w:ascii="Cambria" w:hAnsi="Cambria" w:cs="Times New Roman"/>
-          <w:b w:val="0"/>
-          <w:sz w:val="24"/>
-          <w:szCs w:val="24"/>
-          <w:vertAlign w:val="superscript"/>
-        </w:rPr>
-        <w:tab/>
-      </w:r>
-      <w:r>
-        <w:rPr>
-          <w:rFonts w:ascii="Cambria" w:hAnsi="Cambria" w:cs="Times New Roman"/>
-          <w:b w:val="0"/>
-          <w:sz w:val="24"/>
-          <w:szCs w:val="24"/>
-          <w:vertAlign w:val="superscript"/>
-        </w:rPr>
-        <w:tab/>
-      </w:r>
-    </w:p>
-    <w:p>
-      <w:pPr>
-        <w:pStyle w:val="Tekstpodstawowywcity"/>
-        <w:ind w:left="0"/>
-        <w:jc w:val="both"/>
-        <w:rPr>
-          <w:rFonts w:ascii="Cambria" w:hAnsi="Cambria"/>
-          <w:sz w:val="18"/>
-          <w:szCs w:val="18"/>
-          <w:vertAlign w:val="superscript"/>
-          <w:lang w:val="pl-PL"/>
-        </w:rPr>
-      </w:pPr>
-    </w:p>
-    <w:p>
-      <w:pPr>
-        <w:pStyle w:val="Tekstpodstawowywcity"/>
-        <w:ind w:left="0"/>
-        <w:jc w:val="both"/>
-        <w:rPr>
-          <w:rFonts w:ascii="Cambria" w:hAnsi="Cambria"/>
-          <w:vertAlign w:val="superscript"/>
-        </w:rPr>
-      </w:pPr>
-    </w:p>
-    <w:p>
-      <w:pPr>
-        <w:pStyle w:val="Tekstpodstawowywcity"/>
-        <w:ind w:left="0"/>
-        <w:rPr>
-          <w:rFonts w:ascii="Cambria" w:hAnsi="Cambria"/>
-          <w:sz w:val="20"/>
-          <w:szCs w:val="20"/>
-        </w:rPr>
-      </w:pPr>
-      <w:r>
-        <w:rPr>
-          <w:rFonts w:ascii="Cambria" w:hAnsi="Cambria"/>
-          <w:sz w:val="20"/>
-          <w:szCs w:val="20"/>
-        </w:rPr>
-        <w:t>* niepotrzebne skreślić</w:t>
-      </w:r>
-    </w:p>
-    <w:p>
-      <w:pPr>
-        <w:pStyle w:val="Tekstpodstawowywcity"/>
-        <w:spacing w:line="360" w:lineRule="auto"/>
-        <w:ind w:left="0"/>
-        <w:rPr>
-          <w:rFonts w:ascii="Cambria" w:hAnsi="Cambria"/>
-          <w:b/>
-          <w:lang w:val="pl-PL"/>
-        </w:rPr>
-      </w:pPr>
     </w:p>
     <w:sectPr>
       <w:pgSz w:w="11906" w:h="16838"/>
@@ -5435,7 +5042,6 @@
     <w:uiPriority w:val="99"/>
     <w:semiHidden/>
     <w:unhideWhenUsed/>
-    <w:qFormat/>
     <w:tblPr>
       <w:tblInd w:w="0" w:type="dxa"/>
       <w:tblCellMar>

</xml_diff>